<commit_message>
fix: isola restaurantes e corrige backup, CMV e paginacao
</commit_message>
<xml_diff>
--- a/documentacao/EstoQ_Constituicao_do_Projeto_v1.0.docx
+++ b/documentacao/EstoQ_Constituicao_do_Projeto_v1.0.docx
@@ -158,9 +158,9 @@
               <w:rPr>
                 <w:b/>
               </w:rPr>
-              <w:t>Objetivo deste documento</w:t>
+              <w:t>Objetivo deste documentoDefinir o problema, o escopo, as regras, os módulos e a base técnica do EstoQ antes da implementação. Esta versão consolida as decisões de escopo já validadas, incluindo os três perfis de acesso, uso simultâneo em aparelhos diferentes, aplicação web multitenant, fluxo de itens abertos, alerta de validade configurável e regra de CMV.</w:t>
               <w:br/>
-              <w:t>Definir o problema, o escopo, as regras, os módulos e a base técnica do EstoQ antes da implementação. Esta versão consolida as decisões de escopo já validadas, incluindo os três perfis de acesso, uso simultâneo em aparelhos diferentes, PWA instalável, fluxo de itens abertos, alerta de validade configurável e regra de CMV.</w:t>
+              <w:t/>
             </w:r>
           </w:p>
         </w:tc>
@@ -337,7 +337,7 @@
           </w:tcPr>
           <w:p>
             <w:r>
-              <w:t>PWA instalável (aplicação web) para apoio à gestão de estoque de restaurante</w:t>
+              <w:t>Aplicação web multitenant para apoio à gestão de estoque de restaurante</w:t>
             </w:r>
           </w:p>
         </w:tc>
@@ -671,7 +671,7 @@
           </w:tcPr>
           <w:p>
             <w:r>
-              <w:t>Um restaurante por instalação/ambiente; sem multi-filial na primeira versão</w:t>
+              <w:t>Aplicação web multitenant: vários restaurantes na mesma plataforma, com isolamento por restaurante.</w:t>
             </w:r>
           </w:p>
         </w:tc>
@@ -746,7 +746,7 @@
     </w:p>
     <w:p>
       <w:r>
-        <w:t>Desenvolver um PWA instalável para controle de estoque de um restaurante, capaz de operar simultaneamente em pelo menos três aparelhos, registrar entradas, consumo, abertura de embalagens, desperdícios e ajustes de balanço, controlar validade por lote, calcular o CMV do período e aplicar permissões distintas para ADMIN, COZINHA e NUTRICIONISTA.</w:t>
+        <w:t>Desenvolver uma aplicação web multitenant para controle de estoque de um restaurante, capaz de operar simultaneamente em pelo menos três aparelhos, registrar entradas, consumo, abertura de embalagens, desperdícios e ajustes de balanço, controlar validade por lote, calcular o CMV do período e aplicar permissões distintas para ADMIN, COZINHA e NUTRICIONISTA.</w:t>
       </w:r>
     </w:p>
     <w:p>
@@ -852,7 +852,7 @@
         <w:spacing w:after="50"/>
       </w:pPr>
       <w:r>
-        <w:t>Calcular o CMV absoluto e percentual, comparar o resultado com o percentual ideal definido pelo NUTRICIONISTA e apresentar separadamente indicadores de desperdício e consumo.</w:t>
+        <w:t>Calcular o CMV absoluto e percentual, comparar o resultado com o percentual ideal definido por ADMIN ou NUTRICIONISTA e apresentar separadamente indicadores de desperdício e consumo.</w:t>
       </w:r>
     </w:p>
     <w:p>
@@ -967,7 +967,7 @@
         <w:spacing w:after="50"/>
       </w:pPr>
       <w:r>
-        <w:t>CMV: cálculo por período pela fórmula Estoque Inicial + Compras - Estoque Final; cálculo percentual quando houver receita base informada e comparação com o percentual ideal definido pelo NUTRICIONISTA.</w:t>
+        <w:t>CMV: cálculo por período pela fórmula Estoque Inicial + Compras - Estoque Final; cálculo percentual quando houver receita base informada e comparação com o percentual ideal definido por ADMIN ou NUTRICIONISTA.</w:t>
       </w:r>
     </w:p>
     <w:p>
@@ -1020,7 +1020,7 @@
         <w:spacing w:after="50"/>
       </w:pPr>
       <w:r>
-        <w:t>Gestão de múltiplas filiais/restaurantes na mesma instalação. A primeira versão controla um restaurante por vez.</w:t>
+        <w:t>Aplicativo executável, PWA e operação offline ficam fora do escopo. O sistema é uma aplicação web multitenant.</w:t>
       </w:r>
     </w:p>
     <w:p>
@@ -2994,7 +2994,7 @@
           </w:tcPr>
           <w:p>
             <w:r>
-              <w:t>Permitir ao NUTRICIONISTA definir e atualizar o percentual ideal de CMV do restaurante.</w:t>
+              <w:t>Permitir a ADMIN e NUTRICIONISTA definir e atualizar o percentual ideal de CMV do restaurante.</w:t>
             </w:r>
           </w:p>
         </w:tc>
@@ -3106,7 +3106,7 @@
           </w:tcPr>
           <w:p>
             <w:r>
-              <w:t>Disponibilizar a aplicação como PWA instalável, sem necessidade de desenvolvimento de aplicativo mobile nativo na primeira versão.</w:t>
+              <w:t>Disponibilizar a aplicação como site multitenant, sem executável, instalação obrigatória ou modo offline.</w:t>
             </w:r>
           </w:p>
         </w:tc>
@@ -4346,7 +4346,7 @@
           </w:tcPr>
           <w:p>
             <w:r>
-              <w:t>O percentual ideal de CMV é definido pelo NUTRICIONISTA e deve possuir valor maior que zero e compatível com percentual.</w:t>
+              <w:t>O percentual ideal de CMV pode ser definido por ADMIN e NUTRICIONISTA, deve ser maior que zero e compatível com percentual.</w:t>
             </w:r>
           </w:p>
         </w:tc>
@@ -4450,9 +4450,9 @@
               <w:rPr>
                 <w:b/>
               </w:rPr>
-              <w:t>Definição consolidada</w:t>
+              <w:t>Definição consolidadaCMV do período = Estoque Inicial + Compras/Entradas do período - Estoque Final. Quando a receita base do período for informada, CMV% = (CMV / Receita do período) x 100. ADMIN e NUTRICIONISTA podem definir o percentual ideal de CMV, e o relatório apresenta o valor realizado, a meta e a diferença entre eles.</w:t>
               <w:br/>
-              <w:t>CMV do período = Estoque Inicial + Compras/Entradas do período - Estoque Final. Quando a receita base do período for informada, CMV% = (CMV / Receita do período) x 100. O NUTRICIONISTA define o percentual ideal de CMV, e o relatório apresenta o valor realizado, a meta e a diferença entre eles.</w:t>
+              <w:t/>
             </w:r>
           </w:p>
         </w:tc>
@@ -5439,7 +5439,7 @@
           </w:tcPr>
           <w:p>
             <w:r>
-              <w:t>Armazena o percentual ideal de CMV definido pelo NUTRICIONISTA e a data/usuário da última atualização. Extensão necessária ao UML original para atender ao requisito consolidado.</w:t>
+              <w:t>Armazena o percentual ideal de CMV definido por ADMIN ou NUTRICIONISTA e a data/usuário da última atualização. Extensão necessária ao UML original para atender ao requisito consolidado.</w:t>
             </w:r>
           </w:p>
         </w:tc>
@@ -5452,7 +5452,7 @@
     </w:p>
     <w:p>
       <w:r>
-        <w:t>Relações principais previstas pelo UML: Categoria classifica Produto; Produto possui Lotes e define seu ParametroEstoque; Lote origina ProdutosAbertos; MovimentacaoEstoque pode referir-se a um Lote; Entrada, Consumo, Desperdicio e Ajuste herdam de MovimentacaoEstoque; Balanco é composto por ItemBalanco; ItemBalanco confere um Produto e pode gerar Ajuste; usuários conduzem/solicitam/registram operações do sistema. Como extensão desta constituição, o domínio também deverá persistir o ParametroCmv, vinculado ao restaurante único da instalação e atualizado pelo perfil NUTRICIONISTA.</w:t>
+        <w:t>Relações principais previstas pelo UML: Categoria classifica Produto; Produto possui Lotes e define seu ParametroEstoque; Lote origina ProdutosAbertos; MovimentacaoEstoque pode referir-se a um Lote; Entrada, Consumo, Desperdicio e Ajuste herdam de MovimentacaoEstoque; Balanco é composto por ItemBalanco; ItemBalanco confere um Produto e pode gerar Ajuste; usuários conduzem/solicitam/registram operações do sistema. Como extensão desta constituição, o domínio também deverá persistir o ParametroCmv, vinculado ao restaurante da sessão e atualizado pelo perfil NUTRICIONISTA.</w:t>
       </w:r>
     </w:p>
     <w:p>
@@ -6517,13 +6517,13 @@
     <w:p>
       <w:pPr/>
       <w:r>
-        <w:t>A melhor forma para este projeto é disponibilizar o EstoQ como PWA (Progressive Web App): uma aplicação web instalável pelo navegador, com ícone e execução em janela própria, sem exigir um aplicativo mobile nativo. O usuário acessa o endereço do sistema uma vez e pode instalar a aplicação no aparelho.</w:t>
+        <w:t>O EstoQ é disponibilizado como site multitenant. Os usuários acessam pelo navegador e as operações dependem do backend central e da conexão com a internet.</w:t>
       </w:r>
     </w:p>
     <w:p>
       <w:pPr/>
       <w:r>
-        <w:t>Os três aparelhos não terão bancos locais independentes. ADMIN, COZINHA e NUTRICIONISTA acessarão o mesmo backend pela internet, e o backend utilizará um único banco PostgreSQL do restaurante. Dessa forma, um consumo lançado pela COZINHA modifica o mesmo estoque que o ADMIN e o NUTRICIONISTA consultarão em seguida.</w:t>
+        <w:t>Os aparelhos de um restaurante utilizam o mesmo backend e o banco compartilhado da plataforma. Todas as consultas e gravações operacionais são isoladas pelo restaurante autenticado. Não existem bancos locais independentes.</w:t>
       </w:r>
     </w:p>
     <w:p>
@@ -6546,7 +6546,7 @@
     </w:p>
     <w:p>
       <w:r>
-        <w:t>Stack do backend alinhada ao repositório de referência: Java 21, Spring Boot, Maven, Spring Web MVC, Spring Data JPA, Bean Validation, PostgreSQL e Lombok. O front deverá ser uma PWA instalável; o framework de interface poderá ser definido separadamente. Novas bibliotecas só devem ser adicionadas quando houver necessidade funcional clara e compatibilidade com o conteúdo do curso.</w:t>
+        <w:t>Stack do backend alinhada ao repositório de referência: Java 21, Spring Boot, Maven, Spring Web MVC, Spring Data JPA, Bean Validation, PostgreSQL e Lombok. O front deverá ser uma aplicação web multitenant; o framework de interface poderá ser definido separadamente. Novas bibliotecas só devem ser adicionadas quando houver necessidade funcional clara e compatibilidade com o conteúdo do curso.</w:t>
       </w:r>
     </w:p>
     <w:p>
@@ -6680,7 +6680,7 @@
         <w:spacing w:after="50"/>
       </w:pPr>
       <w:r>
-        <w:t>RNF10 — Centralização: todos os aparelhos devem utilizar o mesmo backend e o mesmo banco de dados do restaurante.</w:t>
+        <w:t>RNF10 — Centralização: todos os aparelhos devem utilizar o mesmo backend e o mesmo banco compartilhado com isolamento por restaurante.</w:t>
       </w:r>
     </w:p>
     <w:p>
@@ -6689,7 +6689,7 @@
         <w:spacing w:after="50"/>
       </w:pPr>
       <w:r>
-        <w:t>RNF11 — Distribuição: a aplicação deve ser instalável como PWA e não depende de desenvolvimento mobile nativo.</w:t>
+        <w:t>RNF11 — Distribuição: aplicação web multitenant acessível pelo navegador; operações dependem de conexão com o backend.</w:t>
       </w:r>
     </w:p>
     <w:p>
@@ -6823,7 +6823,7 @@
         <w:spacing w:after="60"/>
       </w:pPr>
       <w:r>
-        <w:t>Calcular CMV de um período com valores reproduzíveis, calcular CMV% quando houver receita base e comparar com o percentual ideal definido pelo NUTRICIONISTA.</w:t>
+        <w:t>Calcular CMV de um período com valores reproduzíveis, calcular CMV% quando houver receita base e comparar com o percentual ideal definido por ADMIN ou NUTRICIONISTA.</w:t>
       </w:r>
     </w:p>
     <w:p>
@@ -6864,7 +6864,7 @@
         <w:pStyle w:val="ListBullet"/>
       </w:pPr>
       <w:r>
-        <w:t>Instalar a PWA em aparelhos de teste e confirmar que todos consultam o mesmo estado de estoque.</w:t>
+        <w:t>Acessar o site em aparelhos de teste e confirmar o estado compartilhado dentro do restaurante e o isolamento entre restaurantes.</w:t>
       </w:r>
     </w:p>
     <w:p>
@@ -7225,7 +7225,7 @@
           </w:tcPr>
           <w:p>
             <w:r>
-              <w:t>Integração com o front PWA instalável, atualização de estado entre aparelhos e testes de três sessões simultâneas.</w:t>
+              <w:t>Integração com o frontend web multitenant, atualização de estado entre aparelhos e testes de três sessões simultâneas.</w:t>
             </w:r>
           </w:p>
         </w:tc>
@@ -7329,7 +7329,7 @@
         <w:spacing w:after="60"/>
       </w:pPr>
       <w:r>
-        <w:t>O EstoQ controlará um restaurante por vez. Multiempresa/multifilial fica fora da primeira versão.</w:t>
+        <w:t>O EstoQ atende vários restaurantes no mesmo ambiente. Cada usuário opera exclusivamente no restaurante vinculado à sua sessão; PLATAFORMA administra os restaurantes.</w:t>
       </w:r>
     </w:p>
     <w:p>
@@ -7356,7 +7356,7 @@
         <w:spacing w:after="60"/>
       </w:pPr>
       <w:r>
-        <w:t>O CMV seguirá Estoque Inicial + Compras - Estoque Final. O NUTRICIONISTA definirá o percentual ideal de CMV; quando houver receita base informada, o sistema calculará também o CMV percentual para comparação.</w:t>
+        <w:t>O CMV seguirá Estoque Inicial + Compras - Estoque Final. ADMIN e NUTRICIONISTA poderão definir o percentual ideal de CMV; quando houver receita base informada, o sistema calculará também o CMV percentual para comparação.</w:t>
       </w:r>
     </w:p>
     <w:p>
@@ -7374,7 +7374,7 @@
         <w:spacing w:after="60"/>
       </w:pPr>
       <w:r>
-        <w:t>A forma recomendada é PWA instalável, sem app mobile nativo. O usuário acessará o sistema pelo navegador e poderá instalá-lo no aparelho como aplicativo. Os três aparelhos compartilharão o mesmo backend e a mesma base de dados central; após cada operação, as telas consultarão o estado atualizado do servidor.</w:t>
+        <w:t>A distribuição ocorre pelo site, sem instalação de executável ou requisito de PWA. Após cada operação, as telas consultam o servidor e o cache permanece restrito à sessão do restaurante.</w:t>
       </w:r>
     </w:p>
     <w:p>
@@ -7784,7 +7784,7 @@
               <w:rPr>
                 <w:b/>
               </w:rPr>
-              <w:t>PWA</w:t>
+              <w:t>Aplicação web multitenant</w:t>
             </w:r>
           </w:p>
         </w:tc>
@@ -7822,7 +7822,7 @@
           </w:tcPr>
           <w:p>
             <w:r>
-              <w:t>Percentual de referência definido pelo NUTRICIONISTA para comparação com o CMV percentual realizado.</w:t>
+              <w:t>Percentual de referência definido por ADMIN ou NUTRICIONISTA para comparação com o CMV percentual realizado.</w:t>
             </w:r>
           </w:p>
         </w:tc>
@@ -7883,6 +7883,11 @@
       </w:r>
       <w:r>
         <w:t>https://github.com/feitosapedrofatesg-svg/PIAds3.git — consultado para manter o padrão de core genérico + módulos de negócio, DTOs, adapters, validações, services, repositories e controllers.</w:t>
+      </w:r>
+    </w:p>
+    <w:p>
+      <w:r>
+        <w:t>Atualização normativa — 12/10/2026: EstoQ é uma aplicação web multitenant. PLATAFORMA tem acesso exclusivo ao backup completo de todos os restaurantes. ADMIN, COZINHA e NUTRICIONISTA não geram, listam ou baixam esse backup. O backup é manual, baixado imediatamente e temporário no servidor; sua preservação exige armazenar o arquivo fora dele. Não há backup individual por restaurante nesta etapa. ADMIN e NUTRICIONISTA podem configurar a meta de CMV. As demais permissões operacionais são preservadas.</w:t>
       </w:r>
     </w:p>
     <w:sectPr>

</xml_diff>

<commit_message>
docs: consolida documentacao do EstoQ web multitenant e mudancas recentes
</commit_message>
<xml_diff>
--- a/documentacao/EstoQ_Constituicao_do_Projeto_v1.0.docx
+++ b/documentacao/EstoQ_Constituicao_do_Projeto_v1.0.docx
@@ -1,6 +1,6 @@
 
 <file path=word/document.xml><?xml version="1.0" encoding="utf-8"?>
-<w:document xmlns:wpc="http://schemas.microsoft.com/office/word/2010/wordprocessingCanvas" xmlns:mo="http://schemas.microsoft.com/office/mac/office/2008/main" xmlns:mc="http://schemas.openxmlformats.org/markup-compatibility/2006" xmlns:mv="urn:schemas-microsoft-com:mac:vml" xmlns:o="urn:schemas-microsoft-com:office:office" xmlns:r="http://schemas.openxmlformats.org/officeDocument/2006/relationships" xmlns:m="http://schemas.openxmlformats.org/officeDocument/2006/math" xmlns:v="urn:schemas-microsoft-com:vml" xmlns:wp14="http://schemas.microsoft.com/office/word/2010/wordprocessingDrawing" xmlns:wp="http://schemas.openxmlformats.org/drawingml/2006/wordprocessingDrawing" xmlns:w10="urn:schemas-microsoft-com:office:word" xmlns:w="http://schemas.openxmlformats.org/wordprocessingml/2006/main" xmlns:w14="http://schemas.microsoft.com/office/word/2010/wordml" xmlns:wpg="http://schemas.microsoft.com/office/word/2010/wordprocessingGroup" xmlns:wpi="http://schemas.microsoft.com/office/word/2010/wordprocessingInk" xmlns:wne="http://schemas.microsoft.com/office/word/2006/wordml" xmlns:wps="http://schemas.microsoft.com/office/word/2010/wordprocessingShape" mc:Ignorable="w14 wp14">
+<w:document xmlns:ns1="http://schemas.openxmlformats.org/markup-compatibility/2006" xmlns:ns2="http://schemas.openxmlformats.org/officeDocument/2006/relationships" xmlns:w="http://schemas.openxmlformats.org/wordprocessingml/2006/main" ns1:Ignorable="w14 wp14">
   <w:body>
     <w:p>
       <w:r>
@@ -63,7 +63,7 @@
           </w:tcPr>
           <w:p>
             <w:r>
-              <w:t>VERSÃO 1.0 · REQUISITOS FUNCIONAIS CONSOLIDADOS</w:t>
+              <w:t>REVISÃO 1.1 · REQUISITOS CONSOLIDADOS · 12/10/2026</w:t>
             </w:r>
           </w:p>
         </w:tc>
@@ -525,7 +525,7 @@
                 <w:b/>
                 <w:sz w:val="17"/>
               </w:rPr>
-              <w:t>Usuários previstos</w:t>
+              <w:t>Perfis previstos</w:t>
             </w:r>
           </w:p>
         </w:tc>
@@ -543,7 +543,7 @@
           </w:tcPr>
           <w:p>
             <w:r>
-              <w:t>ADMIN, COZINHA e NUTRICIONISTA, com permissões distintas e uso simultâneo</w:t>
+              <w:t>ADMIN, COZINHA e NUTRICIONISTA no restaurante; PLATAFORMA na administração global.</w:t>
             </w:r>
           </w:p>
         </w:tc>
@@ -1047,7 +1047,7 @@
     </w:p>
     <w:p>
       <w:r>
-        <w:t>O diagrama define três perfis de usuário: ADMIN, COZINHA e NUTRICIONISTA. Na primeira versão, autenticação e autorização são obrigatórias. O sistema deve permitir que os três perfis estejam conectados ao mesmo tempo, em aparelhos diferentes, compartilhando o mesmo estoque do restaurante.</w:t>
+        <w:t>O restaurante possui ADMIN, COZINHA e NUTRICIONISTA, com sessões simultâneas e permissões distintas. PLATAFORMA administra os restaurantes e o backup completo, sem operar como ADMIN global de estoque.</w:t>
       </w:r>
     </w:p>
     <w:tbl>
@@ -1685,7 +1685,7 @@
           </w:tcPr>
           <w:p>
             <w:r>
-              <w:t>Consultar</w:t>
+              <w:t>Sim</w:t>
             </w:r>
           </w:p>
         </w:tc>
@@ -4478,7 +4478,7 @@
         <w:spacing w:after="50"/>
       </w:pPr>
       <w:r>
-        <w:t>Usar um balanço confirmado como referência preferencial para estoque inicial/final quando existir.</w:t>
+        <w:t>Reconstruir o estoque inicial/final pelos lotes e deltas das movimentações nas datas de corte; ajustes aplicados de balanço integram o histórico.</w:t>
       </w:r>
     </w:p>
     <w:p>
@@ -4487,7 +4487,7 @@
         <w:spacing w:after="50"/>
       </w:pPr>
       <w:r>
-        <w:t>Na ausência de balanço, reconstruir a posição do estoque a partir das movimentações até a data de corte.</w:t>
+        <w:t>A reconstrução histórica não modifica o saldo armazenado e preserva o custo unitário dos lotes.</w:t>
       </w:r>
     </w:p>
     <w:p>
@@ -7606,7 +7606,7 @@
               <w:rPr>
                 <w:sz w:val="16"/>
               </w:rPr>
-              <w:t>Quantidade disponível calculada no sistema.</w:t>
+              <w:t>Quantidade física calculada pela soma dos lotes. O saldo disponível para consumo é separado e exclui vencidos.</w:t>
             </w:r>
           </w:p>
         </w:tc>
@@ -7794,7 +7794,7 @@
           </w:tcPr>
           <w:p>
             <w:r>
-              <w:t>Progressive Web App: aplicação web que pode ser instalada pelo navegador e executada com aparência de aplicativo, mantendo o backend centralizado.</w:t>
+              <w:t>Aplicação acessada pelo navegador, com vários restaurantes isolados por restaurante_id em um backend/banco compartilhado. Não exige executável ou instalação PWA.</w:t>
             </w:r>
           </w:p>
         </w:tc>
@@ -7886,13 +7886,134 @@
       </w:r>
     </w:p>
     <w:p>
+      <w:pPr>
+        <w:pStyle w:val="Heading1"/>
+      </w:pPr>
       <w:r>
-        <w:t>Atualização normativa — 12/10/2026: EstoQ é uma aplicação web multitenant. PLATAFORMA tem acesso exclusivo ao backup completo de todos os restaurantes. ADMIN, COZINHA e NUTRICIONISTA não geram, listam ou baixam esse backup. O backup é manual, baixado imediatamente e temporário no servidor; sua preservação exige armazenar o arquivo fora dele. Não há backup individual por restaurante nesta etapa. ADMIN e NUTRICIONISTA podem configurar a meta de CMV. As demais permissões operacionais são preservadas.</w:t>
+        <w:t xml:space="preserve">17. Consolidação da implementação — 12/10/2026</w:t>
+      </w:r>
+    </w:p>
+    <w:p>
+      <w:r>
+        <w:t xml:space="preserve">Esta revisão preserva RF01–RF28, RN01–RN27 e os requisitos não funcionais, e consolida as mudanças implementadas até o commit 6bdddad. Os nomes históricos dos arquivos Word foram preservados. A versão equivalente em Markdown está em CONSTITUICAO.md.</w:t>
+      </w:r>
+    </w:p>
+    <w:p>
+      <w:pPr>
+        <w:pStyle w:val="Heading1"/>
+      </w:pPr>
+      <w:r>
+        <w:t xml:space="preserve">17.1 Multitenancy e backup</w:t>
+      </w:r>
+    </w:p>
+    <w:p>
+      <w:r>
+        <w:t xml:space="preserve">O sistema é web multitenant. Cada sessão operacional pertence a um restaurante e não acessa dados de outro. PLATAFORMA administra restaurantes e possui acesso exclusivo ao backup completo do banco/schema configurado. ADMIN, COZINHA e NUTRICIONISTA não geram, listam ou baixam esse dump. Não há backup individual por restaurante nesta etapa. A geração é manual, baixada imediatamente e temporária no servidor; guardar o arquivo fora dele é necessário para preservá-lo.</w:t>
+      </w:r>
+    </w:p>
+    <w:p>
+      <w:pPr>
+        <w:pStyle w:val="Heading1"/>
+      </w:pPr>
+      <w:r>
+        <w:t xml:space="preserve">17.2 Permissões e desperdício</w:t>
+      </w:r>
+    </w:p>
+    <w:p>
+      <w:r>
+        <w:t xml:space="preserve">A COZINHA continua autorizada a registrar consumo, abertura e desperdício operacional, criar/iniciar/contar balanço e consultar dados permitidos. Não acessa o bloco Itens para excluir do estoque, não registra entradas nem executa conclusão/ajustes administrativos. ADMIN e NUTRICIONISTA podem configurar a meta de CMV e informar receita base. Toda diferença negativa de balanço já aplicada integra o desperdício geral, sem gerar segunda baixa.</w:t>
+      </w:r>
+    </w:p>
+    <w:p>
+      <w:pPr>
+        <w:pStyle w:val="Heading1"/>
+      </w:pPr>
+      <w:r>
+        <w:t xml:space="preserve">17.3 Entrada automatizada com revisão</w:t>
+      </w:r>
+    </w:p>
+    <w:p>
+      <w:r>
+        <w:t xml:space="preserve">ADMIN pode analisar XML, PDF com texto ou fotos JPG/PNG de nota fiscal. A análise não muda estoque. A confirmação global exige a conferência final dos itens, descontos e custos rateados, mantendo as validações de quantidade, unidade, fator e custos. Produto existente recebe entrada/lote; produto novo é criado. Vínculos e sugestões de categoria são isolados por restaurante. A confirmação é transacional e idempotente.</w:t>
+      </w:r>
+    </w:p>
+    <w:p>
+      <w:r>
+        <w:t xml:space="preserve">Restaurante novo recebe 13 categorias padrão, meta de CMV 30% e configuração mensal, sem produtos ou estoque. A associação de categorias já está disponível na primeira nota; casos desconhecidos usam Sem classificação. A migração V6 prepara restaurantes ativos elegíveis sem categorias ativas.</w:t>
+      </w:r>
+    </w:p>
+    <w:p>
+      <w:pPr>
+        <w:pStyle w:val="Heading1"/>
+      </w:pPr>
+      <w:r>
+        <w:t xml:space="preserve">17.4 Balanço concorrente e atualização</w:t>
+      </w:r>
+    </w:p>
+    <w:p>
+      <w:r>
+        <w:t xml:space="preserve">O backend bloqueia a raiz do balanço antes de consultar os itens e valida estado e versões. Contagem envia versão do item; início/ajustes enviam versão do balanço; conclusão envia versão do balanço e versões de todos os itens. Conflitos retornam 409 e exigem nova leitura. Balanço concluído rejeita contagens antigas. Não há reabertura implementada.</w:t>
+      </w:r>
+    </w:p>
+    <w:p>
+      <w:r>
+        <w:t xml:space="preserve">Cache em memória da aba reutiliza consultas por sessão: 15 segundos para dados operacionais e um minuto para os demais. Gravações e eventos SSE invalidam o cache antes desses prazos. SSE envia avisos após commit apenas para o restaurante correspondente; polling/reconexão recuperam perdas. Rascunhos locais são preservados e divergências são sinalizadas. Cache não oferece escrita offline.</w:t>
+      </w:r>
+    </w:p>
+    <w:p>
+      <w:r>
+        <w:t xml:space="preserve">O próximo balanço aparece no dashboard e na tela de balanço. O aviso de agendamento vencido é avaliado nas consultas autenticadas dos alertas, sem duplicar ou reabrir o já visto; a data avança ao concluir. Não há avaliação global por scheduler de balanços às 06h.</w:t>
+      </w:r>
+    </w:p>
+    <w:p>
+      <w:pPr>
+        <w:pStyle w:val="Heading1"/>
+      </w:pPr>
+      <w:r>
+        <w:t xml:space="preserve">17.5 Interface, desempenho e horários</w:t>
+      </w:r>
+    </w:p>
+    <w:p>
+      <w:r>
+        <w:t xml:space="preserve">Históricos mostram movimentos recentes primeiro; embalagens abertas seguem a última movimentação/abertura. Isso não altera seleção de lotes para consumo nem a ordenação de catálogo/estoque. Visto na central do cabeçalho remove a linha imediatamente, bloqueia cliques repetidos e devolve o alerta se a gravação falhar.</w:t>
+      </w:r>
+    </w:p>
+    <w:p>
+      <w:r>
+        <w:t xml:space="preserve">Somente os blocos definidos em RESPONSIVIDADE.md começam recolhidos. Histórico de desperdício e embalagens abertas ficam visíveis. Nos relatórios, Desperdício e Consumo médio têm rolagem interna quando há mais de oito itens; Reposição sugerida mantém Maximizar/Minimizar.</w:t>
+      </w:r>
+    </w:p>
+    <w:p>
+      <w:r>
+        <w:t xml:space="preserve">Consultas de balanço carregam os relacionamentos necessários e criam retrato/alertas em lote para evitar consultas por produto. A proteção de concorrência não depende da velocidade de atualização do navegador.</w:t>
+      </w:r>
+    </w:p>
+    <w:p>
+      <w:r>
+        <w:t xml:space="preserve">Horários de eventos/criação/atualização são persistidos em UTC. A API usa LocalDateTime sem offset, interpretado como UTC pela interface e exibido no fuso do navegador: 19:26 UTC aparece como 16:26 na Bahia. Datas sem horário, como validade e agendamento, preservam o dia. Não houve subtração de três horas no banco histórico.</w:t>
+      </w:r>
+    </w:p>
+    <w:p>
+      <w:pPr>
+        <w:pStyle w:val="Heading1"/>
+      </w:pPr>
+      <w:r>
+        <w:t xml:space="preserve">17.6 Validação e limites</w:t>
+      </w:r>
+    </w:p>
+    <w:p>
+      <w:r>
+        <w:t xml:space="preserve">A CI ativa em .github/workflows/validacao.yml executa backend Java 21 com OCR e frontend Node 24 com build/Playwright nas branches dev/main. A implementação recente foi validada por testes de isolamento, transação, versões, SSE, limite de consultas, cache, alertas e horário.</w:t>
+      </w:r>
+    </w:p>
+    <w:p>
+      <w:r>
+        <w:t xml:space="preserve">Sessão, limite de login e SSE estão em memória de uma instância. Backup individual, escrita offline, reabertura de balanço, PDV, emissão fiscal e integração automática de faturamento permanecem fora dos recursos implementados. Consulte HISTORICO_DE_MUDANCAS.md e os contratos de API/desenvolvimento para as entregas e os detalhes atuais.</w:t>
       </w:r>
     </w:p>
     <w:sectPr>
-      <w:headerReference w:type="default" r:id="rId9"/>
-      <w:footerReference w:type="default" r:id="rId10"/>
+      <w:headerReference w:type="default" ns2:id="rId9"/>
+      <w:footerReference w:type="default" ns2:id="rId10"/>
       <w:pgSz w:w="12240" w:h="15840"/>
       <w:pgMar w:top="1077" w:right="1134" w:bottom="964" w:left="1247" w:header="720" w:footer="720" w:gutter="0"/>
       <w:cols w:space="720"/>
@@ -7924,7 +8045,7 @@
 </file>
 
 <file path=word/header1.xml><?xml version="1.0" encoding="utf-8"?>
-<w:hdr xmlns:m="http://schemas.openxmlformats.org/officeDocument/2006/math" xmlns:mc="http://schemas.openxmlformats.org/markup-compatibility/2006" xmlns:mo="http://schemas.microsoft.com/office/mac/office/2008/main" xmlns:mv="urn:schemas-microsoft-com:mac:vml" xmlns:o="urn:schemas-microsoft-com:office:office" xmlns:r="http://schemas.openxmlformats.org/officeDocument/2006/relationships" xmlns:v="urn:schemas-microsoft-com:vml" xmlns:w10="urn:schemas-microsoft-com:office:word" xmlns:w14="http://schemas.microsoft.com/office/word/2010/wordml" xmlns:w="http://schemas.openxmlformats.org/wordprocessingml/2006/main" xmlns:wne="http://schemas.microsoft.com/office/word/2006/wordml" xmlns:wp14="http://schemas.microsoft.com/office/word/2010/wordprocessingDrawing" xmlns:wp="http://schemas.openxmlformats.org/drawingml/2006/wordprocessingDrawing" xmlns:wpc="http://schemas.microsoft.com/office/word/2010/wordprocessingCanvas" xmlns:wpg="http://schemas.microsoft.com/office/word/2010/wordprocessingGroup" xmlns:wpi="http://schemas.microsoft.com/office/word/2010/wordprocessingInk" xmlns:wps="http://schemas.microsoft.com/office/word/2010/wordprocessingShape" mc:Ignorable="w14 wp14">
+<w:hdr xmlns:ns1="http://schemas.openxmlformats.org/markup-compatibility/2006" xmlns:w="http://schemas.openxmlformats.org/wordprocessingml/2006/main" ns1:Ignorable="w14 wp14">
   <w:p>
     <w:pPr>
       <w:pStyle w:val="Header"/>

</xml_diff>